<commit_message>
IT 2부 10화 Trattare al buio, 사망 시점 정정
Co-Authored-By: Claude Sonnet 5.5 <noreply@anthropic.com>
Claude-Session: https://claude.ai/code/session_013X2zbh4kERceyuaxxZfq31
</commit_message>
<xml_diff>
--- a/Diplomata_IT/docx/2부1화_Le_suore_rapite.docx
+++ b/Diplomata_IT/docx/2부1화_Le_suore_rapite.docx
@@ -7102,7 +7102,7 @@
           <w:i w:val="0"/>
           <w:sz w:val="22"/>
         </w:rPr>
-        <w:t>Sono giovani del villaggio. Hanno perso un fratello l'anno scorso. Un bambino di nove anni.</w:t>
+        <w:t>Sono giovani del villaggio. Hanno perso un fratello tre anni fa. Un bambino di nove anni.</w:t>
       </w:r>
     </w:p>
     <w:p>
@@ -7118,7 +7118,7 @@
           <w:color w:val="555555"/>
           <w:sz w:val="19"/>
         </w:rPr>
-        <w:t>마을 청년들이에요. 지난해 형제를 잃었습니다. 아홉 살 아이였어요.</w:t>
+        <w:t>마을 청년들이에요. 3년 전 형제를 잃었습니다. 아홉 살 아이였어요.</w:t>
       </w:r>
     </w:p>
     <w:p>

</xml_diff>